<commit_message>
Point email sending at the deployed resend-email function
Two things stopped the deployed function being reachable:
- the app called /functions/v1/send-email but the function was deployed
  as resend-email; the name is now configurable via _SB.emailFn and the
  repo folder renamed to match.
- every request sent the publishable key as the bearer token. Edge
  Functions verify a real user JWT and reject that with
  401 INVALID_CREDENTIALS, so email calls now send the signed-in user's
  access token instead.

Co-Authored-By: Claude Opus 4.8 <noreply@anthropic.com>
</commit_message>
<xml_diff>
--- a/Cubic_CMS_Scoping_Document_FINAL.docx
+++ b/Cubic_CMS_Scoping_Document_FINAL.docx
@@ -4920,13 +4920,13 @@
         <w:spacing w:after="120"/>
         <w:rPr>
           <w:b/>
-          <w:color w:val="000000"/>
+          <w:color w:val="FF0000"/>
         </w:rPr>
       </w:pPr>
       <w:r>
         <w:rPr>
           <w:b/>
-          <w:color w:val="000000"/>
+          <w:color w:val="FF0000"/>
         </w:rPr>
         <w:t>INTEGRATIONS</w:t>
       </w:r>
@@ -4960,7 +4960,22 @@
           <w:color w:val="000000"/>
           <w:sz w:val="21"/>
         </w:rPr>
-        <w:t xml:space="preserve"> API. External parties (Subcontractors/Vendors, Architect/Engineer reviewers, and Clients where relevant) interact only through the specific approval actions already scoped elsewhere in this document — e-signing a Subcontractor &amp; Vendor Agreement (Rule 30) and, in a future revision, approving an Estimate — not through open system access.</w:t>
+        <w:t xml:space="preserve"> API. External parties (Subcontractors/Vendors, Architect/Engineer reviewers, and Clients where relevant) interact only through the specific approval actions already scoped elsewhere in this document — e-signing a Subcontractor &amp; </w:t>
+      </w:r>
+      <w:r>
+        <w:rPr>
+          <w:color w:val="000000"/>
+          <w:sz w:val="21"/>
+          <w:highlight w:val="yellow"/>
+        </w:rPr>
+        <w:t>Vendor Agreement (Rule 30)</w:t>
+      </w:r>
+      <w:r>
+        <w:rPr>
+          <w:color w:val="000000"/>
+          <w:sz w:val="21"/>
+        </w:rPr>
+        <w:t xml:space="preserve"> and, in a future revision, approving an Estimate — not through open system access.</w:t>
       </w:r>
     </w:p>
     <w:p>
@@ -4991,6 +5006,7 @@
         <w:rPr>
           <w:color w:val="000000"/>
           <w:sz w:val="21"/>
+          <w:highlight w:val="yellow"/>
         </w:rPr>
         <w:t>Schedule files (Module 08): MPP/MPX/XER/XML/PPX files are brought in as a one-time or periodic file transfer from MS Project or Primavera P6 by default; a live two-way sync is preferred if feasible, to be confirmed during technical scoping.</w:t>
       </w:r>
@@ -4999,13 +5015,13 @@
       <w:pPr>
         <w:spacing w:after="120"/>
         <w:rPr>
-          <w:color w:val="000000"/>
-          <w:sz w:val="21"/>
-        </w:rPr>
-      </w:pPr>
-      <w:r>
-        <w:rPr>
-          <w:color w:val="000000"/>
+          <w:color w:val="FF0000"/>
+          <w:sz w:val="21"/>
+        </w:rPr>
+      </w:pPr>
+      <w:r>
+        <w:rPr>
+          <w:color w:val="FF0000"/>
           <w:sz w:val="21"/>
         </w:rPr>
         <w:t xml:space="preserve">E-signature (Rule 30): e-sign is native to the system, not a third-party provider (e.g. </w:t>
@@ -5013,7 +5029,7 @@
       <w:proofErr w:type="spellStart"/>
       <w:r>
         <w:rPr>
-          <w:color w:val="000000"/>
+          <w:color w:val="FF0000"/>
           <w:sz w:val="21"/>
         </w:rPr>
         <w:t>DocuSign</w:t>
@@ -5021,7 +5037,7 @@
       <w:proofErr w:type="spellEnd"/>
       <w:r>
         <w:rPr>
-          <w:color w:val="000000"/>
+          <w:color w:val="FF0000"/>
           <w:sz w:val="21"/>
         </w:rPr>
         <w:t>, Adobe Sign).</w:t>
@@ -5032,13 +5048,13 @@
         <w:spacing w:after="120"/>
         <w:rPr>
           <w:b/>
-          <w:color w:val="000000"/>
+          <w:color w:val="FF0000"/>
         </w:rPr>
       </w:pPr>
       <w:r>
         <w:rPr>
           <w:b/>
-          <w:color w:val="000000"/>
+          <w:color w:val="FF0000"/>
         </w:rPr>
         <w:t>NOTIFICATION ENGINE</w:t>
       </w:r>
@@ -5072,7 +5088,22 @@
           <w:color w:val="000000"/>
           <w:sz w:val="21"/>
         </w:rPr>
-        <w:t>Overdue / escalation (RFIs, Submittals, Variations, Daily Logs, Punch List): recipients and channel follow the SLA &amp; Escalation Policy above (PM/Superintendent at 3 business days, Admin at 7, by email and SMS). Not configurable — these cannot be muted by the recipient, since they exist to surface risk.</w:t>
+        <w:t xml:space="preserve">Overdue / escalation (RFIs, Submittals, </w:t>
+      </w:r>
+      <w:r>
+        <w:rPr>
+          <w:color w:val="000000"/>
+          <w:sz w:val="21"/>
+          <w:highlight w:val="yellow"/>
+        </w:rPr>
+        <w:t>Variations, Daily Logs, Punch List</w:t>
+      </w:r>
+      <w:r>
+        <w:rPr>
+          <w:color w:val="000000"/>
+          <w:sz w:val="21"/>
+        </w:rPr>
+        <w:t>): recipients and channel follow the SLA &amp; Escalation Policy above (PM/Superintendent at 3 business days, Admin at 7, by email and SMS). Not configurable — these cannot be muted by the recipient, since they exist to surface risk.</w:t>
       </w:r>
     </w:p>
     <w:p>

</xml_diff>